<commit_message>
added to the word doc the decision about rounding tox means
</commit_message>
<xml_diff>
--- a/SQOUnified_Package_Guide.docx
+++ b/SQOUnified_Package_Guide.docx
@@ -703,7 +703,7 @@
           <w:sz w:val="21"/>
           <w:szCs w:val="21"/>
         </w:rPr>
-        <w:t xml:space="preserve">12</w:t>
+        <w:t xml:space="preserve">13</w:t>
       </w:r>
     </w:p>
     <w:p>
@@ -739,7 +739,7 @@
           <w:sz w:val="20"/>
           <w:szCs w:val="20"/>
         </w:rPr>
-        <w:t xml:space="preserve">12</w:t>
+        <w:t xml:space="preserve">13</w:t>
       </w:r>
     </w:p>
     <w:p>
@@ -775,7 +775,7 @@
           <w:sz w:val="21"/>
           <w:szCs w:val="21"/>
         </w:rPr>
-        <w:t xml:space="preserve">12</w:t>
+        <w:t xml:space="preserve">13</w:t>
       </w:r>
     </w:p>
     <w:p>
@@ -811,7 +811,7 @@
           <w:sz w:val="21"/>
           <w:szCs w:val="21"/>
         </w:rPr>
-        <w:t xml:space="preserve">12</w:t>
+        <w:t xml:space="preserve">13</w:t>
       </w:r>
     </w:p>
     <w:p>
@@ -847,7 +847,7 @@
           <w:sz w:val="21"/>
           <w:szCs w:val="21"/>
         </w:rPr>
-        <w:t xml:space="preserve">13</w:t>
+        <w:t xml:space="preserve">14</w:t>
       </w:r>
     </w:p>
     <w:p>
@@ -883,7 +883,7 @@
           <w:sz w:val="21"/>
           <w:szCs w:val="21"/>
         </w:rPr>
-        <w:t xml:space="preserve">13</w:t>
+        <w:t xml:space="preserve">14</w:t>
       </w:r>
     </w:p>
     <w:p>
@@ -1554,7 +1554,7 @@
         <w:t xml:space="preserve">Charles Wong</w:t>
       </w:r>
       <w:r>
-        <w:t xml:space="preserve">, and </w:t>
+        <w:t xml:space="preserve">, </w:t>
       </w:r>
       <w:r>
         <w:rPr>
@@ -1562,6 +1562,16 @@
           <w:bCs/>
         </w:rPr>
         <w:t xml:space="preserve">Ken Schiff</w:t>
+      </w:r>
+      <w:r>
+        <w:t xml:space="preserve">, and </w:t>
+      </w:r>
+      <w:r>
+        <w:rPr>
+          <w:b/>
+          <w:bCs/>
+        </w:rPr>
+        <w:t xml:space="preserve">Alvina Mehinto</w:t>
       </w:r>
       <w:r>
         <w:t xml:space="preserve">; several benthic-index choices were made collectively by the </w:t>
@@ -6554,6 +6564,154 @@
                 <w:sz w:val="20"/>
                 <w:szCs w:val="20"/>
               </w:rPr>
+              <w:t xml:space="preserve">Alvina Mehinto</w:t>
+            </w:r>
+            <w:r>
+              <w:rPr>
+                <w:i/>
+                <w:iCs/>
+                <w:color w:val="8A6A2A"/>
+                <w:sz w:val="18"/>
+                <w:szCs w:val="18"/>
+              </w:rPr>
+              <w:t xml:space="preserve">   ·   Early August 2026</w:t>
+            </w:r>
+          </w:p>
+          <w:p>
+            <w:pPr>
+              <w:spacing w:after="60" w:line="264"/>
+            </w:pPr>
+            <w:r>
+              <w:t xml:space="preserve">Before a test result is compared to the category ranges, its mean percentage is </w:t>
+            </w:r>
+            <w:r>
+              <w:rPr>
+                <w:b/>
+                <w:bCs/>
+              </w:rPr>
+              <w:t xml:space="preserve">rounded to the nearest whole number</w:t>
+            </w:r>
+            <w:r>
+              <w:t xml:space="preserve"> using conventional (round-half-up) rounding. This was added after an edge case: a Mytilus normal-development mean of </w:t>
+            </w:r>
+            <w:r>
+              <w:rPr>
+                <w:b/>
+                <w:bCs/>
+              </w:rPr>
+              <w:t xml:space="preserve">79.5</w:t>
+            </w:r>
+            <w:r>
+              <w:t xml:space="preserve"> was placed in Low Toxicity by the unrounded package (below the 80% Nontoxic cutoff), while Darrin's Excel tool — the state's gold-standard reference — rounded it to 80 and classified it Nontoxic. Rounding first makes the package agree with that tool.</w:t>
+            </w:r>
+          </w:p>
+          <w:p>
+            <w:pPr>
+              <w:pBdr>
+                <w:left w:val="single" w:color="1E6B4F" w:sz="14" w:space="4"/>
+              </w:pBdr>
+              <w:shd w:fill="EFF6F1" w:color="auto" w:val="clear"/>
+              <w:spacing w:after="40" w:line="262"/>
+              <w:ind w:left="60"/>
+            </w:pPr>
+            <w:r>
+              <w:rPr>
+                <w:color w:val="1A4635"/>
+                <w:sz w:val="18"/>
+                <w:szCs w:val="18"/>
+              </w:rPr>
+              <w:t xml:space="preserve">This is consistent with the manual. Page 90 states that “Values should be rounded to the nearest whole percentage” before comparison to the response ranges, and the Table 5.2 category boundaries (p.87) are defined as whole numbers — so the ranges assume rounded, integer means. The half-up method matches the toxicity-LOE rounding decision above (implemented with janitor::round_half_up).</w:t>
+            </w:r>
+          </w:p>
+          <w:p>
+            <w:pPr>
+              <w:spacing w:after="40"/>
+            </w:pPr>
+            <w:r>
+              <w:rPr>
+                <w:b/>
+                <w:bCs/>
+                <w:color w:val="8A6A2A"/>
+                <w:sz w:val="17"/>
+                <w:szCs w:val="17"/>
+              </w:rPr>
+              <w:t xml:space="preserve">Attribution:  </w:t>
+            </w:r>
+            <w:r>
+              <w:rPr>
+                <w:sz w:val="17"/>
+                <w:szCs w:val="17"/>
+              </w:rPr>
+              <w:t xml:space="preserve">Per Alvina Mehinto (first week of August 2026); added to the code after version 0.10.19.</w:t>
+            </w:r>
+          </w:p>
+          <w:p>
+            <w:pPr>
+              <w:spacing w:after="0"/>
+            </w:pPr>
+            <w:r>
+              <w:rPr>
+                <w:i/>
+                <w:iCs/>
+                <w:color w:val="8A6A2A"/>
+                <w:sz w:val="17"/>
+                <w:szCs w:val="17"/>
+              </w:rPr>
+              <w:t xml:space="preserve">R/toxicity.R — “round to the nearest whole percentage before making the comparison for a category.”</w:t>
+            </w:r>
+          </w:p>
+        </w:tc>
+      </w:tr>
+    </w:tbl>
+    <w:p>
+      <w:pPr>
+        <w:spacing w:after="100"/>
+      </w:pPr>
+    </w:p>
+    <w:tbl>
+      <w:tblPr>
+        <w:tblW w:type="dxa" w:w="9200"/>
+        <w:tblBorders>
+          <w:top w:val="single" w:color="auto" w:sz="4"/>
+          <w:left w:val="single" w:color="auto" w:sz="4"/>
+          <w:bottom w:val="single" w:color="auto" w:sz="4"/>
+          <w:right w:val="single" w:color="auto" w:sz="4"/>
+          <w:insideH w:val="single" w:color="auto" w:sz="4"/>
+          <w:insideV w:val="single" w:color="auto" w:sz="4"/>
+        </w:tblBorders>
+      </w:tblPr>
+      <w:tblGrid>
+        <w:gridCol w:w="9200"/>
+      </w:tblGrid>
+      <w:tr>
+        <w:tc>
+          <w:tcPr>
+            <w:tcBorders>
+              <w:top w:val="single" w:color="E8DABB" w:sz="2"/>
+              <w:left w:val="single" w:color="C08A2B" w:sz="24"/>
+              <w:bottom w:val="single" w:color="E8DABB" w:sz="2"/>
+              <w:right w:val="single" w:color="E8DABB" w:sz="2"/>
+            </w:tcBorders>
+            <w:shd w:fill="FBF3E4" w:color="auto" w:val="clear"/>
+            <w:tcMar>
+              <w:top w:type="dxa" w:w="90"/>
+              <w:left w:type="dxa" w:w="150"/>
+              <w:bottom w:type="dxa" w:w="90"/>
+              <w:right w:type="dxa" w:w="120"/>
+            </w:tcMar>
+          </w:tcPr>
+          <w:p>
+            <w:pPr>
+              <w:spacing w:after="40"/>
+            </w:pPr>
+            <w:r>
+              <w:rPr>
+                <w:b/>
+                <w:bCs/>
+                <w:color w:val="6B4A12"/>
+                <w:sz w:val="20"/>
+                <w:szCs w:val="20"/>
+              </w:rPr>
               <w:t xml:space="preserve">One-category improvement when not significantly different</w:t>
             </w:r>
           </w:p>
@@ -7737,7 +7895,7 @@
       <w:pPr>
         <w:spacing w:after="140"/>
       </w:pPr>
-      <w:hyperlink w:history="1" r:id="rIduaevd9ockbx2ygpr3_aic">
+      <w:hyperlink w:history="1" r:id="rIdqurbq98c3_nclgzpuy4md">
         <w:r>
           <w:rPr>
             <w:rStyle w:val="Hyperlink"/>
@@ -7758,7 +7916,7 @@
       <w:r>
         <w:t xml:space="preserve">If you hit a problem, the maintainers prefer that you open an </w:t>
       </w:r>
-      <w:hyperlink w:history="1" r:id="rIdjq5kzu530riuzwhk-csdw">
+      <w:hyperlink w:history="1" r:id="rIdnzxwbbs_1y6sxm5iera3f">
         <w:r>
           <w:rPr>
             <w:rStyle w:val="Hyperlink"/>

</xml_diff>